<commit_message>
Lito 40 dias: revisão Parte 3
Co-Authored-By: Claude Opus 5.5 <noreply@anthropic.com>
Claude-Session: https://claude.ai/code/session_01MJjUEEZrxQDEUifKK2vj9g
</commit_message>
<xml_diff>
--- a/roteiros/lito-sousa-morte/LitoSousa40_Parte3.docx
+++ b/roteiros/lito-sousa-morte/LitoSousa40_Parte3.docx
@@ -119,15 +119,7 @@
         <w:rPr>
           <w:color w:val="000000"/>
         </w:rPr>
-        <w:t>No país, só a Anvisa podia liberar a entrada de uma substância que nunca tinha sido aprovada em lugar nenhum. E o pedido precisava passar pelo mesmo caminho que qualquer outro, com documentos, avaliação técnica e prazos.</w:t>
-      </w:r>
-    </w:p>
-    <w:p>
-      <w:r>
-        <w:rPr>
-          <w:color w:val="000000"/>
-        </w:rPr>
-        <w:t>Sem autorização da Anvisa, o frasco não podia entrar no país.</w:t>
+        <w:t>No país, só a Anvisa podia liberar a entrada de uma substância que nunca tinha sido aprovada em lugar nenhum. Sem essa autorização, o frasco não passava da alfândega.</w:t>
       </w:r>
     </w:p>
     <w:p>
@@ -247,7 +239,7 @@
         <w:rPr>
           <w:color w:val="C00000"/>
         </w:rPr>
-        <w:t>Guarde esse vídeo de quatro de setembro. Foi a última vez que o Lito de verdade apareceu diante de uma câmera. E, semanas depois, o perfil dele ia mostrar um outro Lito. Um que falava sem esforço nenhum.</w:t>
+        <w:t>Guarde esse vídeo de quatro de setembro. Foi uma das últimas vezes que o público viu o Lito de verdade. E, semanas depois, o perfil dele ia mostrar um outro Lito. Um que falava sem esforço nenhum.</w:t>
       </w:r>
     </w:p>
     <w:p>
@@ -271,15 +263,7 @@
         <w:rPr>
           <w:color w:val="000000"/>
         </w:rPr>
-        <w:t>E o tempo estava contra ele. Quando o remédio finalmente chegou, Lito já estava de volta ao Einstein, sob cuidados intensivos.</w:t>
-      </w:r>
-    </w:p>
-    <w:p>
-      <w:r>
-        <w:rPr>
-          <w:color w:val="000000"/>
-        </w:rPr>
-        <w:t>Cada dia sem tratamento era um dia a mais para a doença avançar. E ninguém sabia quantos dias ainda restavam.</w:t>
+        <w:t>Quando o remédio finalmente chegou, Lito já estava de volta ao Einstein, sob cuidados intensivos. E ninguém sabia quantos dias ainda restavam.</w:t>
       </w:r>
     </w:p>
     <w:p>
@@ -311,7 +295,7 @@
         <w:rPr>
           <w:color w:val="000000"/>
         </w:rPr>
-        <w:t>O homem que tinha explicado ao Brasil centenas de pousos e decolagens não estava ali para ver o pouso mais importante da própria vida. Estava num leito de hospital, do outro lado da cidade, esperando.</w:t>
+        <w:t>O homem que tinha explicado ao Brasil centenas de pousos e decolagens não estava ali para ver o pouso mais importante da própria vida. Estava num leito de hospital, a poucos quilômetros dali, esperando.</w:t>
       </w:r>
     </w:p>
     <w:p>
@@ -319,7 +303,7 @@
         <w:rPr>
           <w:color w:val="000000"/>
         </w:rPr>
-        <w:t>Para que ela não perdesse horas na burocracia, uma operação juntou a Receita Federal, a Anvisa, a Polícia Federal e uma empresa de táxi aéreo.</w:t>
+        <w:t>Para que a caixa não perdesse horas na burocracia, uma operação juntou a Receita Federal, a Anvisa, a Polícia Federal e uma empresa de táxi aéreo.</w:t>
       </w:r>
     </w:p>
     <w:p>
@@ -375,7 +359,7 @@
         <w:rPr>
           <w:color w:val="000000"/>
         </w:rPr>
-        <w:t>Pouco mais de dois meses antes, Lito tinha gravado aquele vídeo de julho falando dos planos. Fazer sessenta anos em janeiro. Jogar futebol com o filho.</w:t>
+        <w:t>Pouco mais de dois meses antes, Lito tinha gravado aquele vídeo de julho falando dos planos. Fazer sessenta anos em janeiro. Jogar futebol com o filho. Naquele dia de julho, nenhum dos dois planos parecia distante.</w:t>
       </w:r>
     </w:p>
     <w:p>
@@ -399,7 +383,7 @@
         <w:rPr>
           <w:color w:val="000000"/>
         </w:rPr>
-        <w:t>O homem que passou trinta anos cuidando de aeronaves que levavam vidas de um lugar para outro estava deitado num leito, esperando uma aeronave que levava a última chance da vida dele.</w:t>
+        <w:t>Uma caixa pequena cruzando o céu de São Paulo. E, num quarto de hospital, uma família contando os minutos, sem saber se aquilo ainda ia chegar a tempo.</w:t>
       </w:r>
     </w:p>
     <w:p>
@@ -439,13 +423,13 @@
         <w:rPr>
           <w:color w:val="000000"/>
         </w:rPr>
-        <w:t>O remédio entrou no corpo de Lito.</w:t>
+        <w:t>Num quarto do Einstein, o remédio entrou no corpo de Lito.</w:t>
       </w:r>
     </w:p>
     <w:p>
       <w:r>
         <w:rPr>
-          <w:color w:val="1F4EB4"/>
+          <w:color w:val="000000"/>
         </w:rPr>
         <w:t>Pela primeira vez na história, um paciente com a doença de Creutzfeldt-Jakob recebia o ALN-6457.</w:t>
       </w:r>
@@ -453,7 +437,7 @@
     <w:p>
       <w:r>
         <w:rPr>
-          <w:color w:val="1F4EB4"/>
+          <w:color w:val="000000"/>
         </w:rPr>
         <w:t>Lito Sousa, o mecânico nascido em Natal, virou o primeiro ser humano do mundo a experimentar aquele remédio.</w:t>
       </w:r>

</xml_diff>